<commit_message>
docs: remove redundant ch5(chapter) + ch6(non-func) from outline design, remove 3.1.8 test points from detailed design
</commit_message>
<xml_diff>
--- a/docs/概要设计/概要设计说明书.docx
+++ b/docs/概要设计/概要设计说明书.docx
@@ -9930,461 +9930,6 @@
       </w:r>
     </w:p>
     <w:p/>
-    <w:p>
-      <w:pPr>
-        <w:pStyle w:val="Heading2"/>
-      </w:pPr>
-      <w:r>
-        <w:t>5. 算法设计概要</w:t>
-      </w:r>
-    </w:p>
-    <w:p>
-      <w:pPr>
-        <w:pStyle w:val="Heading3"/>
-      </w:pPr>
-      <w:r>
-        <w:t>5.1 余弦相似度公式</w:t>
-      </w:r>
-    </w:p>
-    <w:p>
-      <w:pPr>
-        <w:ind w:left="360"/>
-      </w:pPr>
-      <w:r>
-        <w:rPr>
-          <w:rFonts w:ascii="Courier New" w:hAnsi="Courier New"/>
-          <w:color w:val="2D2D2D"/>
-          <w:sz w:val="18"/>
-        </w:rPr>
-        <w:t>cos(θ) = (A · B) / (|A| × |B|)</w:t>
-        <w:br/>
-        <w:br/>
-        <w:t>其中：</w:t>
-        <w:br/>
-        <w:t xml:space="preserve">  A = [a₁, a₂, ..., aₙ]  猫咪 A 的特征向量</w:t>
-        <w:br/>
-        <w:t xml:space="preserve">  B = [b₁, b₂, ..., bₙ]  猫咪 B 的特征向量</w:t>
-        <w:br/>
-        <w:t xml:space="preserve">  aᵢ, bᵢ ∈ {0, 1}       One-Hot 编码值</w:t>
-      </w:r>
-    </w:p>
-    <w:p/>
-    <w:p>
-      <w:pPr>
-        <w:pStyle w:val="Heading3"/>
-      </w:pPr>
-      <w:r>
-        <w:t>5.2 综合推荐分数</w:t>
-      </w:r>
-    </w:p>
-    <w:p>
-      <w:pPr>
-        <w:ind w:left="360"/>
-      </w:pPr>
-      <w:r>
-        <w:rPr>
-          <w:rFonts w:ascii="Courier New" w:hAnsi="Courier New"/>
-          <w:color w:val="2D2D2D"/>
-          <w:sz w:val="18"/>
-        </w:rPr>
-        <w:t>Score = α · cos(θ) + β₁ · LikeNorm + β₂ · FollowNorm + β₃ · RatingNorm</w:t>
-        <w:br/>
-        <w:br/>
-        <w:t>其中：</w:t>
-        <w:br/>
-        <w:t xml:space="preserve">  α, β₁, β₂, β₃    权重系数（默认 α=0.7, β₁=0.1, β₂=0.1, β₃=0.1）</w:t>
-        <w:br/>
-        <w:t xml:space="preserve">  LikeNorm          点赞数归一化值 [0, 1]</w:t>
-        <w:br/>
-        <w:t xml:space="preserve">  FollowNorm        关注数归一化值 [0, 1]</w:t>
-        <w:br/>
-        <w:t xml:space="preserve">  RatingNorm        评分均分归一化值 [0, 1]</w:t>
-      </w:r>
-    </w:p>
-    <w:p/>
-    <w:p>
-      <w:pPr>
-        <w:pStyle w:val="Heading3"/>
-      </w:pPr>
-      <w:r>
-        <w:t>5.3 特征编码维度</w:t>
-      </w:r>
-    </w:p>
-    <w:tbl>
-      <w:tblPr>
-        <w:tblW w:type="auto" w:w="0"/>
-        <w:jc w:val="center"/>
-        <w:tblLook w:firstColumn="1" w:firstRow="1" w:lastColumn="0" w:lastRow="0" w:noHBand="0" w:noVBand="1" w:val="04A0"/>
-        <w:tblBorders>
-          <w:top w:val="single" w:sz="4" w:space="0" w:color="000000"/>
-          <w:left w:val="single" w:sz="4" w:space="0" w:color="000000"/>
-          <w:bottom w:val="single" w:sz="4" w:space="0" w:color="000000"/>
-          <w:right w:val="single" w:sz="4" w:space="0" w:color="000000"/>
-          <w:insideH w:val="single" w:sz="4" w:space="0" w:color="000000"/>
-          <w:insideV w:val="single" w:sz="4" w:space="0" w:color="000000"/>
-        </w:tblBorders>
-      </w:tblPr>
-      <w:tblGrid>
-        <w:gridCol w:w="2880"/>
-        <w:gridCol w:w="2880"/>
-        <w:gridCol w:w="2880"/>
-      </w:tblGrid>
-      <w:tr>
-        <w:tc>
-          <w:tcPr>
-            <w:tcW w:type="dxa" w:w="3024"/>
-            <w:shd w:fill="D9E2F3" w:val="clear"/>
-          </w:tcPr>
-          <w:p>
-            <w:r/>
-            <w:r>
-              <w:rPr>
-                <w:b/>
-                <w:sz w:val="18"/>
-              </w:rPr>
-              <w:t>特征</w:t>
-            </w:r>
-          </w:p>
-        </w:tc>
-        <w:tc>
-          <w:tcPr>
-            <w:tcW w:type="dxa" w:w="3024"/>
-            <w:shd w:fill="D9E2F3" w:val="clear"/>
-          </w:tcPr>
-          <w:p>
-            <w:r/>
-            <w:r>
-              <w:rPr>
-                <w:b/>
-                <w:sz w:val="18"/>
-              </w:rPr>
-              <w:t>维度</w:t>
-            </w:r>
-          </w:p>
-        </w:tc>
-        <w:tc>
-          <w:tcPr>
-            <w:tcW w:type="dxa" w:w="3024"/>
-            <w:shd w:fill="D9E2F3" w:val="clear"/>
-          </w:tcPr>
-          <w:p>
-            <w:r/>
-            <w:r>
-              <w:rPr>
-                <w:b/>
-                <w:sz w:val="18"/>
-              </w:rPr>
-              <w:t>编码方式</w:t>
-            </w:r>
-          </w:p>
-        </w:tc>
-      </w:tr>
-      <w:tr>
-        <w:tc>
-          <w:tcPr>
-            <w:tcW w:type="dxa" w:w="3024"/>
-            <w:shd w:fill="F2F2F2" w:val="clear"/>
-          </w:tcPr>
-          <w:p>
-            <w:r/>
-            <w:r>
-              <w:rPr>
-                <w:sz w:val="18"/>
-              </w:rPr>
-              <w:t>毛色标签 (colour_tags)</w:t>
-            </w:r>
-          </w:p>
-        </w:tc>
-        <w:tc>
-          <w:tcPr>
-            <w:tcW w:type="dxa" w:w="3024"/>
-            <w:shd w:fill="F2F2F2" w:val="clear"/>
-          </w:tcPr>
-          <w:p>
-            <w:r/>
-            <w:r>
-              <w:rPr>
-                <w:sz w:val="18"/>
-              </w:rPr>
-              <w:t>按实际标签数量</w:t>
-            </w:r>
-          </w:p>
-        </w:tc>
-        <w:tc>
-          <w:tcPr>
-            <w:tcW w:type="dxa" w:w="3024"/>
-            <w:shd w:fill="F2F2F2" w:val="clear"/>
-          </w:tcPr>
-          <w:p>
-            <w:r/>
-            <w:r>
-              <w:rPr>
-                <w:sz w:val="18"/>
-              </w:rPr>
-              <w:t>One-Hot（如"橘色;白色"→[1,1,0,...]）</w:t>
-            </w:r>
-          </w:p>
-        </w:tc>
-      </w:tr>
-      <w:tr>
-        <w:tc>
-          <w:tcPr>
-            <w:tcW w:type="dxa" w:w="3024"/>
-          </w:tcPr>
-          <w:p>
-            <w:r/>
-            <w:r>
-              <w:rPr>
-                <w:sz w:val="18"/>
-              </w:rPr>
-              <w:t>性格标签 (personality_tags)</w:t>
-            </w:r>
-          </w:p>
-        </w:tc>
-        <w:tc>
-          <w:tcPr>
-            <w:tcW w:type="dxa" w:w="3024"/>
-          </w:tcPr>
-          <w:p>
-            <w:r/>
-            <w:r>
-              <w:rPr>
-                <w:sz w:val="18"/>
-              </w:rPr>
-              <w:t>按实际标签数量</w:t>
-            </w:r>
-          </w:p>
-        </w:tc>
-        <w:tc>
-          <w:tcPr>
-            <w:tcW w:type="dxa" w:w="3024"/>
-          </w:tcPr>
-          <w:p>
-            <w:r/>
-            <w:r>
-              <w:rPr>
-                <w:sz w:val="18"/>
-              </w:rPr>
-              <w:t>One-Hot</w:t>
-            </w:r>
-          </w:p>
-        </w:tc>
-      </w:tr>
-      <w:tr>
-        <w:tc>
-          <w:tcPr>
-            <w:tcW w:type="dxa" w:w="3024"/>
-            <w:shd w:fill="F2F2F2" w:val="clear"/>
-          </w:tcPr>
-          <w:p>
-            <w:r/>
-            <w:r>
-              <w:rPr>
-                <w:sz w:val="18"/>
-              </w:rPr>
-              <w:t>位置 (location_area)</w:t>
-            </w:r>
-          </w:p>
-        </w:tc>
-        <w:tc>
-          <w:tcPr>
-            <w:tcW w:type="dxa" w:w="3024"/>
-            <w:shd w:fill="F2F2F2" w:val="clear"/>
-          </w:tcPr>
-          <w:p>
-            <w:r/>
-            <w:r>
-              <w:rPr>
-                <w:sz w:val="18"/>
-              </w:rPr>
-              <w:t>按实际区域数量</w:t>
-            </w:r>
-          </w:p>
-        </w:tc>
-        <w:tc>
-          <w:tcPr>
-            <w:tcW w:type="dxa" w:w="3024"/>
-            <w:shd w:fill="F2F2F2" w:val="clear"/>
-          </w:tcPr>
-          <w:p>
-            <w:r/>
-            <w:r>
-              <w:rPr>
-                <w:sz w:val="18"/>
-              </w:rPr>
-              <w:t>One-Hot</w:t>
-            </w:r>
-          </w:p>
-        </w:tc>
-      </w:tr>
-      <w:tr>
-        <w:tc>
-          <w:tcPr>
-            <w:tcW w:type="dxa" w:w="3024"/>
-          </w:tcPr>
-          <w:p>
-            <w:r/>
-            <w:r>
-              <w:rPr>
-                <w:sz w:val="18"/>
-              </w:rPr>
-              <w:t>性别 (gender)</w:t>
-            </w:r>
-          </w:p>
-        </w:tc>
-        <w:tc>
-          <w:tcPr>
-            <w:tcW w:type="dxa" w:w="3024"/>
-          </w:tcPr>
-          <w:p>
-            <w:r/>
-            <w:r>
-              <w:rPr>
-                <w:sz w:val="18"/>
-              </w:rPr>
-              <w:t>3（男/女/未知）</w:t>
-            </w:r>
-          </w:p>
-        </w:tc>
-        <w:tc>
-          <w:tcPr>
-            <w:tcW w:type="dxa" w:w="3024"/>
-          </w:tcPr>
-          <w:p>
-            <w:r/>
-            <w:r>
-              <w:rPr>
-                <w:sz w:val="18"/>
-              </w:rPr>
-              <w:t>One-Hot</w:t>
-            </w:r>
-          </w:p>
-        </w:tc>
-      </w:tr>
-    </w:tbl>
-    <w:p/>
-    <w:p>
-      <w:pPr>
-        <w:pStyle w:val="Heading2"/>
-      </w:pPr>
-      <w:r>
-        <w:t>6. 非功能设计</w:t>
-      </w:r>
-    </w:p>
-    <w:p>
-      <w:pPr>
-        <w:pStyle w:val="Heading3"/>
-      </w:pPr>
-      <w:r>
-        <w:t>6.1 安全性设计</w:t>
-      </w:r>
-    </w:p>
-    <w:p>
-      <w:pPr>
-        <w:pStyle w:val="ListBullet"/>
-        <w:spacing w:after="40" w:before="20"/>
-        <w:ind w:left="360"/>
-      </w:pPr>
-      <w:r>
-        <w:t>密码使用 BCrypt 加密存储</w:t>
-      </w:r>
-    </w:p>
-    <w:p>
-      <w:pPr>
-        <w:pStyle w:val="ListBullet"/>
-        <w:spacing w:after="40" w:before="20"/>
-        <w:ind w:left="360"/>
-      </w:pPr>
-      <w:r>
-        <w:t>API 请求统一经过 JWT 过滤器鉴权</w:t>
-      </w:r>
-    </w:p>
-    <w:p>
-      <w:pPr>
-        <w:pStyle w:val="ListBullet"/>
-        <w:spacing w:after="40" w:before="20"/>
-        <w:ind w:left="360"/>
-      </w:pPr>
-      <w:r>
-        <w:t>数据库密码和 JWT 密钥通过环境变量或 `application-dev.yml` 配置</w:t>
-      </w:r>
-    </w:p>
-    <w:p>
-      <w:pPr>
-        <w:pStyle w:val="Heading3"/>
-      </w:pPr>
-      <w:r>
-        <w:t>6.2 性能设计</w:t>
-      </w:r>
-    </w:p>
-    <w:p>
-      <w:pPr>
-        <w:pStyle w:val="ListBullet"/>
-        <w:spacing w:after="40" w:before="20"/>
-        <w:ind w:left="360"/>
-      </w:pPr>
-      <w:r>
-        <w:t>猫咪推荐结果可缓存（缓存有效期 30 分钟）</w:t>
-      </w:r>
-    </w:p>
-    <w:p>
-      <w:pPr>
-        <w:pStyle w:val="ListBullet"/>
-        <w:spacing w:after="40" w:before="20"/>
-        <w:ind w:left="360"/>
-      </w:pPr>
-      <w:r>
-        <w:t>特征向量预计算存储在 `cat.feature_vector` 字段，避免重复计算</w:t>
-      </w:r>
-    </w:p>
-    <w:p>
-      <w:pPr>
-        <w:pStyle w:val="ListBullet"/>
-        <w:spacing w:after="40" w:before="20"/>
-        <w:ind w:left="360"/>
-      </w:pPr>
-      <w:r>
-        <w:t>热度因子统计通过定时任务（每 15 分钟）批量更新</w:t>
-      </w:r>
-    </w:p>
-    <w:p>
-      <w:pPr>
-        <w:pStyle w:val="Heading3"/>
-      </w:pPr>
-      <w:r>
-        <w:t>6.3 可维护性设计</w:t>
-      </w:r>
-    </w:p>
-    <w:p>
-      <w:pPr>
-        <w:pStyle w:val="ListBullet"/>
-        <w:spacing w:after="40" w:before="20"/>
-        <w:ind w:left="360"/>
-      </w:pPr>
-      <w:r>
-        <w:t>后端采用经典三层架构：Controller → Service → Repository</w:t>
-      </w:r>
-    </w:p>
-    <w:p>
-      <w:pPr>
-        <w:pStyle w:val="ListBullet"/>
-        <w:spacing w:after="40" w:before="20"/>
-        <w:ind w:left="360"/>
-      </w:pPr>
-      <w:r>
-        <w:t>算法模块独立封装 `CatSimilarityAlgorithm`，便于替换/升级</w:t>
-      </w:r>
-    </w:p>
-    <w:p>
-      <w:pPr>
-        <w:pStyle w:val="ListBullet"/>
-        <w:spacing w:after="40" w:before="20"/>
-        <w:ind w:left="360"/>
-      </w:pPr>
-      <w:r>
-        <w:t>所有配置项集中管理，支持多环境切换</w:t>
-      </w:r>
-    </w:p>
     <w:sectPr>
       <w:pgSz w:w="12240" w:h="15840"/>
       <w:pgMar w:top="1440" w:right="1800" w:bottom="1440" w:left="1800" w:header="720" w:footer="720" w:gutter="0"/>

</xml_diff>

<commit_message>
docs: convert all SVGs to white background, fix white-on-white text
- Change 8 dark-themed SVGs (DFD, ER, sequence, use-case) from bg=#0f172a to white
- Change 3 root-level flowcharts from dark to white background
- Adjust text and stroke colors for readability on white bg
- Regenerate all 4 docx files with updated SVGs
- Add new diagram SVGs to tracking
</commit_message>
<xml_diff>
--- a/docs/概要设计/概要设计说明书.docx
+++ b/docs/概要设计/概要设计说明书.docx
@@ -1042,7 +1042,7 @@
               <a:graphicData uri="http://schemas.openxmlformats.org/drawingml/2006/picture">
                 <pic:pic>
                   <pic:nvPicPr>
-                    <pic:cNvPr id="0" name="tmp5yrr5_1s.png"/>
+                    <pic:cNvPr id="0" name="tmp9nnzers5.png"/>
                     <pic:cNvPicPr/>
                   </pic:nvPicPr>
                   <pic:blipFill>
@@ -2035,42 +2035,8 @@
       </w:r>
     </w:p>
     <w:p>
-      <w:pPr>
-        <w:jc w:val="center"/>
-      </w:pPr>
       <w:r>
-        <w:drawing>
-          <wp:inline xmlns:a="http://schemas.openxmlformats.org/drawingml/2006/main" xmlns:pic="http://schemas.openxmlformats.org/drawingml/2006/picture">
-            <wp:extent cx="5029200" cy="3885057"/>
-            <wp:docPr id="2" name="Picture 2"/>
-            <wp:cNvGraphicFramePr>
-              <a:graphicFrameLocks noChangeAspect="1"/>
-            </wp:cNvGraphicFramePr>
-            <a:graphic>
-              <a:graphicData uri="http://schemas.openxmlformats.org/drawingml/2006/picture">
-                <pic:pic>
-                  <pic:nvPicPr>
-                    <pic:cNvPr id="0" name="tmpylw129mv.png"/>
-                    <pic:cNvPicPr/>
-                  </pic:nvPicPr>
-                  <pic:blipFill>
-                    <a:blip r:embed="rId10"/>
-                    <a:stretch>
-                      <a:fillRect/>
-                    </a:stretch>
-                  </pic:blipFill>
-                  <pic:spPr>
-                    <a:xfrm>
-                      <a:off x="0" y="0"/>
-                      <a:ext cx="5029200" cy="3885057"/>
-                    </a:xfrm>
-                    <a:prstGeom prst="rect"/>
-                  </pic:spPr>
-                </pic:pic>
-              </a:graphicData>
-            </a:graphic>
-          </wp:inline>
-        </w:drawing>
+        <w:t>[图: sequence-recommend.svg]</w:t>
       </w:r>
     </w:p>
     <w:p>
@@ -3101,42 +3067,8 @@
       </w:r>
     </w:p>
     <w:p>
-      <w:pPr>
-        <w:jc w:val="center"/>
-      </w:pPr>
       <w:r>
-        <w:drawing>
-          <wp:inline xmlns:a="http://schemas.openxmlformats.org/drawingml/2006/main" xmlns:pic="http://schemas.openxmlformats.org/drawingml/2006/picture">
-            <wp:extent cx="5029200" cy="3201924"/>
-            <wp:docPr id="3" name="Picture 3"/>
-            <wp:cNvGraphicFramePr>
-              <a:graphicFrameLocks noChangeAspect="1"/>
-            </wp:cNvGraphicFramePr>
-            <a:graphic>
-              <a:graphicData uri="http://schemas.openxmlformats.org/drawingml/2006/picture">
-                <pic:pic>
-                  <pic:nvPicPr>
-                    <pic:cNvPr id="0" name="tmpwcnxt77a.png"/>
-                    <pic:cNvPicPr/>
-                  </pic:nvPicPr>
-                  <pic:blipFill>
-                    <a:blip r:embed="rId11"/>
-                    <a:stretch>
-                      <a:fillRect/>
-                    </a:stretch>
-                  </pic:blipFill>
-                  <pic:spPr>
-                    <a:xfrm>
-                      <a:off x="0" y="0"/>
-                      <a:ext cx="5029200" cy="3201924"/>
-                    </a:xfrm>
-                    <a:prstGeom prst="rect"/>
-                  </pic:spPr>
-                </pic:pic>
-              </a:graphicData>
-            </a:graphic>
-          </wp:inline>
-        </w:drawing>
+        <w:t>[图: sequence-login.svg]</w:t>
       </w:r>
     </w:p>
     <w:p>

</xml_diff>

<commit_message>
docs: redesign E-R diagram with cleaner layout and white bg
- Reorganize entity positions in 3-column grid to minimize line crossings
- Add relationship labels (1/N markers) to all connections
- Use light theme (white bg, dark text) matching other diagrams
- Add font-family for proper Chinese rendering
</commit_message>
<xml_diff>
--- a/docs/概要设计/概要设计说明书.docx
+++ b/docs/概要设计/概要设计说明书.docx
@@ -1033,7 +1033,7 @@
       <w:r>
         <w:drawing>
           <wp:inline xmlns:a="http://schemas.openxmlformats.org/drawingml/2006/main" xmlns:pic="http://schemas.openxmlformats.org/drawingml/2006/picture">
-            <wp:extent cx="5029200" cy="3675507"/>
+            <wp:extent cx="5029200" cy="3981450"/>
             <wp:docPr id="1" name="Picture 1"/>
             <wp:cNvGraphicFramePr>
               <a:graphicFrameLocks noChangeAspect="1"/>
@@ -1042,7 +1042,7 @@
               <a:graphicData uri="http://schemas.openxmlformats.org/drawingml/2006/picture">
                 <pic:pic>
                   <pic:nvPicPr>
-                    <pic:cNvPr id="0" name="tmp9nnzers5.png"/>
+                    <pic:cNvPr id="0" name="tmp69c826ig.png"/>
                     <pic:cNvPicPr/>
                   </pic:nvPicPr>
                   <pic:blipFill>
@@ -1054,7 +1054,7 @@
                   <pic:spPr>
                     <a:xfrm>
                       <a:off x="0" y="0"/>
-                      <a:ext cx="5029200" cy="3675507"/>
+                      <a:ext cx="5029200" cy="3981450"/>
                     </a:xfrm>
                     <a:prstGeom prst="rect"/>
                   </pic:spPr>

</xml_diff>

<commit_message>
fix: repair SVG markers, clean UI section, regenerate docx
- Add missing arrow markers to DFD, sequence, use-case SVGs (cairosvg fix)
- Remove ASCII art box diagrams from UI section, keep only screenshots
- Remove all emoji characters from detailed design
- Restore 4.5/4.6/4.7 section headers (lost during emoji cleanup)
- Regenerate all docx with properly rendered SVGs
</commit_message>
<xml_diff>
--- a/docs/概要设计/概要设计说明书.docx
+++ b/docs/概要设计/概要设计说明书.docx
@@ -1042,7 +1042,7 @@
               <a:graphicData uri="http://schemas.openxmlformats.org/drawingml/2006/picture">
                 <pic:pic>
                   <pic:nvPicPr>
-                    <pic:cNvPr id="0" name="tmp69c826ig.png"/>
+                    <pic:cNvPr id="0" name="tmpka1r73yh.png"/>
                     <pic:cNvPicPr/>
                   </pic:nvPicPr>
                   <pic:blipFill>
@@ -2035,8 +2035,42 @@
       </w:r>
     </w:p>
     <w:p>
+      <w:pPr>
+        <w:jc w:val="center"/>
+      </w:pPr>
       <w:r>
-        <w:t>[图: sequence-recommend.svg]</w:t>
+        <w:drawing>
+          <wp:inline xmlns:a="http://schemas.openxmlformats.org/drawingml/2006/main" xmlns:pic="http://schemas.openxmlformats.org/drawingml/2006/picture">
+            <wp:extent cx="5029200" cy="3885057"/>
+            <wp:docPr id="2" name="Picture 2"/>
+            <wp:cNvGraphicFramePr>
+              <a:graphicFrameLocks noChangeAspect="1"/>
+            </wp:cNvGraphicFramePr>
+            <a:graphic>
+              <a:graphicData uri="http://schemas.openxmlformats.org/drawingml/2006/picture">
+                <pic:pic>
+                  <pic:nvPicPr>
+                    <pic:cNvPr id="0" name="tmp7ep1mj2w.png"/>
+                    <pic:cNvPicPr/>
+                  </pic:nvPicPr>
+                  <pic:blipFill>
+                    <a:blip r:embed="rId10"/>
+                    <a:stretch>
+                      <a:fillRect/>
+                    </a:stretch>
+                  </pic:blipFill>
+                  <pic:spPr>
+                    <a:xfrm>
+                      <a:off x="0" y="0"/>
+                      <a:ext cx="5029200" cy="3885057"/>
+                    </a:xfrm>
+                    <a:prstGeom prst="rect"/>
+                  </pic:spPr>
+                </pic:pic>
+              </a:graphicData>
+            </a:graphic>
+          </wp:inline>
+        </w:drawing>
       </w:r>
     </w:p>
     <w:p>
@@ -3067,8 +3101,42 @@
       </w:r>
     </w:p>
     <w:p>
+      <w:pPr>
+        <w:jc w:val="center"/>
+      </w:pPr>
       <w:r>
-        <w:t>[图: sequence-login.svg]</w:t>
+        <w:drawing>
+          <wp:inline xmlns:a="http://schemas.openxmlformats.org/drawingml/2006/main" xmlns:pic="http://schemas.openxmlformats.org/drawingml/2006/picture">
+            <wp:extent cx="5029200" cy="3201924"/>
+            <wp:docPr id="3" name="Picture 3"/>
+            <wp:cNvGraphicFramePr>
+              <a:graphicFrameLocks noChangeAspect="1"/>
+            </wp:cNvGraphicFramePr>
+            <a:graphic>
+              <a:graphicData uri="http://schemas.openxmlformats.org/drawingml/2006/picture">
+                <pic:pic>
+                  <pic:nvPicPr>
+                    <pic:cNvPr id="0" name="tmp_3ao84yv.png"/>
+                    <pic:cNvPicPr/>
+                  </pic:nvPicPr>
+                  <pic:blipFill>
+                    <a:blip r:embed="rId11"/>
+                    <a:stretch>
+                      <a:fillRect/>
+                    </a:stretch>
+                  </pic:blipFill>
+                  <pic:spPr>
+                    <a:xfrm>
+                      <a:off x="0" y="0"/>
+                      <a:ext cx="5029200" cy="3201924"/>
+                    </a:xfrm>
+                    <a:prstGeom prst="rect"/>
+                  </pic:spPr>
+                </pic:pic>
+              </a:graphicData>
+            </a:graphic>
+          </wp:inline>
+        </w:drawing>
       </w:r>
     </w:p>
     <w:p>

</xml_diff>

<commit_message>
fix: restore deleted Chinese text, clean UI section properly
- Restore Chinese text that was accidentally deleted by overly broad emoji regex
- Remove ASCII art box diagrams from 4.3 and 4.4 (keep only screenshots)
- Remove specific emoji characters only (cat face, green circle, etc.)
- Preserve all Chinese text (3138 CJK chars verified intact)
- Add missing arrow markers to DFD/sequence SVGs for cairosvg conversion
- Regenerate docx files
</commit_message>
<xml_diff>
--- a/docs/概要设计/概要设计说明书.docx
+++ b/docs/概要设计/概要设计说明书.docx
@@ -1042,7 +1042,7 @@
               <a:graphicData uri="http://schemas.openxmlformats.org/drawingml/2006/picture">
                 <pic:pic>
                   <pic:nvPicPr>
-                    <pic:cNvPr id="0" name="tmpka1r73yh.png"/>
+                    <pic:cNvPr id="0" name="tmpuh47x8w7.png"/>
                     <pic:cNvPicPr/>
                   </pic:nvPicPr>
                   <pic:blipFill>
@@ -2050,7 +2050,7 @@
               <a:graphicData uri="http://schemas.openxmlformats.org/drawingml/2006/picture">
                 <pic:pic>
                   <pic:nvPicPr>
-                    <pic:cNvPr id="0" name="tmp7ep1mj2w.png"/>
+                    <pic:cNvPr id="0" name="tmp_wey857s.png"/>
                     <pic:cNvPicPr/>
                   </pic:nvPicPr>
                   <pic:blipFill>
@@ -3116,7 +3116,7 @@
               <a:graphicData uri="http://schemas.openxmlformats.org/drawingml/2006/picture">
                 <pic:pic>
                   <pic:nvPicPr>
-                    <pic:cNvPr id="0" name="tmp_3ao84yv.png"/>
+                    <pic:cNvPr id="0" name="tmp96twsq82.png"/>
                     <pic:cNvPicPr/>
                   </pic:nvPicPr>
                   <pic:blipFill>

</xml_diff>